<commit_message>
feat: add fixed asset management module for equipment inventory and assignment
</commit_message>
<xml_diff>
--- a/src/features/maestros/activo-fijo/plantillas/entrega-equipos.docx
+++ b/src/features/maestros/activo-fijo/plantillas/entrega-equipos.docx
@@ -4086,38 +4086,12 @@
     </w:p>
     <w:p>
       <w:pPr>
-        <w:autoSpaceDE w:val="0"/>
-        <w:autoSpaceDN w:val="0"/>
-        <w:adjustRightInd w:val="0"/>
-        <w:ind w:left="2832" w:firstLine="708"/>
+        <w:jc w:val="center"/>
+        <w:ind w:left="2229" w:right="2941"/>
         <w:rPr>
           <w:lang w:val="es-PE"/>
         </w:rPr>
       </w:pPr>
-      <w:r>
-        <w:rPr>
-          <w:rStyle w:val="selectable-text"/>
-        </w:rPr>
-        <w:t>(</w:t>
-      </w:r>
-      <w:r>
-        <w:rPr>
-          <w:rStyle w:val="selectable-text"/>
-        </w:rPr>
-        <w:t>Nombre</w:t>
-      </w:r>
-      <w:r>
-        <w:rPr>
-          <w:rStyle w:val="selectable-text"/>
-        </w:rPr>
-        <w:t>)</w:t>
-      </w:r>
-      <w:r>
-        <w:rPr>
-          <w:rStyle w:val="selectable-text"/>
-        </w:rPr>
-        <w:t xml:space="preserve">: </w:t>
-      </w:r>
       <w:r>
         <w:rPr>
           <w:rStyle w:val="selectable-text"/>
@@ -4136,7 +4110,6 @@
           <w:rFonts w:ascii="Arial" w:hAnsi="Arial" w:cs="Arial"/>
           <w:lang w:val="es-PE"/>
         </w:rPr>
-        <w:t xml:space="preserve">      </w:t>
       </w:r>
       <w:r>
         <w:rPr>

</xml_diff>